<commit_message>
CCC agenda for October 20: discussion section
Adds section 05, Discussion: the GEOC alignment form letter, the
proposal submission timeline, and the revision of the CLASS
Curriculum Committee Policies and Procedures. The committee README
line for the agenda lists the discussion items.

Co-Authored-By: Claude Opus 5.5 <noreply@anthropic.com>
Claude-Session: https://claude.ai/code/session_01ANoLqPC3dVC2EorFLCgw4p
</commit_message>
<xml_diff>
--- a/committee/ccc/agendas/2026-10-20-agenda.docx
+++ b/committee/ccc/agendas/2026-10-20-agenda.docx
@@ -1189,6 +1189,76 @@
           <w:szCs w:val="23"/>
         </w:rPr>
         <w:t xml:space="preserve">6. Policing Studies BPS, projected degree proposal for the Academic Master Plan (AMP) and resource implications (2026–2027 academic year).</w:t>
+      </w:r>
+    </w:p>
+    <w:p>
+      <w:pPr>
+        <w:keepNext/>
+        <w:spacing w:after="120" w:before="280" w:line="336"/>
+      </w:pPr>
+      <w:r>
+        <w:rPr>
+          <w:rFonts w:ascii="Montserrat" w:cs="Montserrat" w:eastAsia="Montserrat" w:hAnsi="Montserrat"/>
+          <w:b/>
+          <w:bCs/>
+          <w:color w:val="D50032"/>
+          <w:sz w:val="26"/>
+          <w:szCs w:val="26"/>
+        </w:rPr>
+        <w:t xml:space="preserve">05</w:t>
+      </w:r>
+      <w:r>
+        <w:rPr>
+          <w:rFonts w:ascii="Montserrat" w:cs="Montserrat" w:eastAsia="Montserrat" w:hAnsi="Montserrat"/>
+          <w:b/>
+          <w:bCs/>
+          <w:color w:val="000000"/>
+          <w:sz w:val="26"/>
+          <w:szCs w:val="26"/>
+        </w:rPr>
+        <w:t xml:space="preserve">   Discussion</w:t>
+      </w:r>
+    </w:p>
+    <w:p>
+      <w:pPr>
+        <w:spacing w:after="140" w:before="0" w:line="336"/>
+      </w:pPr>
+      <w:r>
+        <w:rPr>
+          <w:rFonts w:ascii="Roboto Serif" w:cs="Roboto Serif" w:eastAsia="Roboto Serif" w:hAnsi="Roboto Serif"/>
+          <w:color w:val="000000"/>
+          <w:sz w:val="23"/>
+          <w:szCs w:val="23"/>
+        </w:rPr>
+        <w:t xml:space="preserve">7. GEOC alignment form: the committee’s letter, its addressee, and whether it endorses the proposed short form.</w:t>
+      </w:r>
+    </w:p>
+    <w:p>
+      <w:pPr>
+        <w:spacing w:after="140" w:before="0" w:line="336"/>
+      </w:pPr>
+      <w:r>
+        <w:rPr>
+          <w:rFonts w:ascii="Roboto Serif" w:cs="Roboto Serif" w:eastAsia="Roboto Serif" w:hAnsi="Roboto Serif"/>
+          <w:color w:val="000000"/>
+          <w:sz w:val="23"/>
+          <w:szCs w:val="23"/>
+        </w:rPr>
+        <w:t xml:space="preserve">8. Proposal submission timeline: Curriculog form availability and the launch deadline.</w:t>
+      </w:r>
+    </w:p>
+    <w:p>
+      <w:pPr>
+        <w:spacing w:after="140" w:before="0" w:line="336"/>
+      </w:pPr>
+      <w:r>
+        <w:rPr>
+          <w:rFonts w:ascii="Roboto Serif" w:cs="Roboto Serif" w:eastAsia="Roboto Serif" w:hAnsi="Roboto Serif"/>
+          <w:color w:val="000000"/>
+          <w:sz w:val="23"/>
+          <w:szCs w:val="23"/>
+        </w:rPr>
+        <w:t xml:space="preserve">9. CLASS Curriculum Committee Policies and Procedures, revision: the review standard for proposals.</w:t>
       </w:r>
     </w:p>
     <w:sectPr>

</xml_diff>

<commit_message>
CCC agenda for October 20: discussion item detail
Each discussion item now carries a short summary and the decision
or question before the committee.

Co-Authored-By: Claude Opus 5.5 <noreply@anthropic.com>
Claude-Session: https://claude.ai/code/session_01ANoLqPC3dVC2EorFLCgw4p
</commit_message>
<xml_diff>
--- a/committee/ccc/agendas/2026-10-20-agenda.docx
+++ b/committee/ccc/agendas/2026-10-20-agenda.docx
@@ -1221,7 +1221,8 @@
     </w:p>
     <w:p>
       <w:pPr>
-        <w:spacing w:after="140" w:before="0" w:line="336"/>
+        <w:keepNext/>
+        <w:spacing w:after="60" w:before="120" w:line="336"/>
       </w:pPr>
       <w:r>
         <w:rPr>
@@ -1230,12 +1231,13 @@
           <w:sz w:val="23"/>
           <w:szCs w:val="23"/>
         </w:rPr>
-        <w:t xml:space="preserve">7. GEOC alignment form: the committee’s letter, its addressee, and whether it endorses the proposed short form.</w:t>
+        <w:t xml:space="preserve">7. GEOC alignment form: the committee’s letter.</w:t>
       </w:r>
     </w:p>
     <w:p>
       <w:pPr>
         <w:spacing w:after="140" w:before="0" w:line="336"/>
+        <w:ind w:left="360"/>
       </w:pPr>
       <w:r>
         <w:rPr>
@@ -1244,12 +1246,13 @@
           <w:sz w:val="23"/>
           <w:szCs w:val="23"/>
         </w:rPr>
-        <w:t xml:space="preserve">8. Proposal submission timeline: Curriculog form availability and the launch deadline.</w:t>
-      </w:r>
-    </w:p>
-    <w:p>
-      <w:pPr>
-        <w:spacing w:after="140" w:before="0" w:line="336"/>
+        <w:t xml:space="preserve">The CLASS Council of Chairs recommended that the committee state its position on the 2026/2027 GEOC alignment form in a letter. For decision: the letter’s addressee (GEOC, CIC, or the Academic Senate), whether it endorses the proposed one-page alignment form sent to the GE Director on September 2, and its timing.</w:t>
+      </w:r>
+    </w:p>
+    <w:p>
+      <w:pPr>
+        <w:keepNext/>
+        <w:spacing w:after="60" w:before="120" w:line="336"/>
       </w:pPr>
       <w:r>
         <w:rPr>
@@ -1258,7 +1261,52 @@
           <w:sz w:val="23"/>
           <w:szCs w:val="23"/>
         </w:rPr>
-        <w:t xml:space="preserve">9. CLASS Curriculum Committee Policies and Procedures, revision: the review standard for proposals.</w:t>
+        <w:t xml:space="preserve">8. Proposal submission timeline.</w:t>
+      </w:r>
+    </w:p>
+    <w:p>
+      <w:pPr>
+        <w:spacing w:after="140" w:before="0" w:line="336"/>
+        <w:ind w:left="360"/>
+      </w:pPr>
+      <w:r>
+        <w:rPr>
+          <w:rFonts w:ascii="Roboto Serif" w:cs="Roboto Serif" w:eastAsia="Roboto Serif" w:hAnsi="Roboto Serif"/>
+          <w:color w:val="000000"/>
+          <w:sz w:val="23"/>
+          <w:szCs w:val="23"/>
+        </w:rPr>
+        <w:t xml:space="preserve">Curriculog forms open in mid-August, about 20 duty days before the September 15 launch deadline. Requests raised with the committee: forms available in January for the following September, a shorter campus-wide consultation period, a shorter approval chain, and a launch deadline of September 25 or October 1. The committee has asked Catalog to open forms earlier, and Catalog split the former shared deadline into separate launch and approval deadlines. For discussion: who sets the launch deadline and form availability, and whether the committee takes the matter up this year, and with whom.</w:t>
+      </w:r>
+    </w:p>
+    <w:p>
+      <w:pPr>
+        <w:keepNext/>
+        <w:spacing w:after="60" w:before="120" w:line="336"/>
+      </w:pPr>
+      <w:r>
+        <w:rPr>
+          <w:rFonts w:ascii="Roboto Serif" w:cs="Roboto Serif" w:eastAsia="Roboto Serif" w:hAnsi="Roboto Serif"/>
+          <w:color w:val="000000"/>
+          <w:sz w:val="23"/>
+          <w:szCs w:val="23"/>
+        </w:rPr>
+        <w:t xml:space="preserve">9. CLASS Curriculum Committee Policies and Procedures, revision.</w:t>
+      </w:r>
+    </w:p>
+    <w:p>
+      <w:pPr>
+        <w:spacing w:after="140" w:before="0" w:line="336"/>
+        <w:ind w:left="360"/>
+      </w:pPr>
+      <w:r>
+        <w:rPr>
+          <w:rFonts w:ascii="Roboto Serif" w:cs="Roboto Serif" w:eastAsia="Roboto Serif" w:hAnsi="Roboto Serif"/>
+          <w:color w:val="000000"/>
+          <w:sz w:val="23"/>
+          <w:szCs w:val="23"/>
+        </w:rPr>
+        <w:t xml:space="preserve">The proposed revision adds a review standard (section 07). The committee sets how closely it reviews syllabi at its first meeting of each academic year, with structural issues as the default focus: learning outcomes, content, assignments, and grading, and their consistency with the proposal. Banking and discontinuation proposals are approved automatically. The committee approves a proposal, approves it with small revisions, or rolls it back for major revisions. Other changes: the associate dean forwards proposals for a vote or for discussion, and the dean’s office replaces the curriculum coordinator. The revision goes to the CLASS Council for approval.</w:t>
       </w:r>
     </w:p>
     <w:sectPr>

</xml_diff>